<commit_message>
submission of wk4 lab
</commit_message>
<xml_diff>
--- a/Week4_Lab/submission.docx
+++ b/Week4_Lab/submission.docx
@@ -30,20 +30,56 @@
         <w:t xml:space="preserve"> </w:t>
       </w:r>
       <w:r>
-        <w:t xml:space="preserve">Mount and </w:t>
-      </w:r>
-      <w:proofErr w:type="gramStart"/>
-      <w:r>
-        <w:t>Run</w:t>
-      </w:r>
-      <w:proofErr w:type="gramEnd"/>
+        <w:t>Mount and Run</w:t>
+      </w:r>
       <w:r>
         <w:br/>
       </w:r>
       <w:r>
+        <w:drawing>
+          <wp:inline distT="0" distB="0" distL="0" distR="0" wp14:anchorId="1AF05207" wp14:editId="60472568">
+            <wp:extent cx="5731510" cy="2771140"/>
+            <wp:effectExtent l="0" t="0" r="2540" b="0"/>
+            <wp:docPr id="251430640" name="Picture 1"/>
+            <wp:cNvGraphicFramePr>
+              <a:graphicFrameLocks xmlns:a="http://schemas.openxmlformats.org/drawingml/2006/main" noChangeAspect="1"/>
+            </wp:cNvGraphicFramePr>
+            <a:graphic xmlns:a="http://schemas.openxmlformats.org/drawingml/2006/main">
+              <a:graphicData uri="http://schemas.openxmlformats.org/drawingml/2006/picture">
+                <pic:pic xmlns:pic="http://schemas.openxmlformats.org/drawingml/2006/picture">
+                  <pic:nvPicPr>
+                    <pic:cNvPr id="251430640" name=""/>
+                    <pic:cNvPicPr/>
+                  </pic:nvPicPr>
+                  <pic:blipFill>
+                    <a:blip r:embed="rId5"/>
+                    <a:stretch>
+                      <a:fillRect/>
+                    </a:stretch>
+                  </pic:blipFill>
+                  <pic:spPr>
+                    <a:xfrm>
+                      <a:off x="0" y="0"/>
+                      <a:ext cx="5731510" cy="2771140"/>
+                    </a:xfrm>
+                    <a:prstGeom prst="rect">
+                      <a:avLst/>
+                    </a:prstGeom>
+                  </pic:spPr>
+                </pic:pic>
+              </a:graphicData>
+            </a:graphic>
+          </wp:inline>
+        </w:drawing>
+      </w:r>
+      <w:r>
         <w:br/>
       </w:r>
       <w:r>
+        <w:br/>
+      </w:r>
+      <w:r>
+        <w:lastRenderedPageBreak/>
         <w:t>5</w:t>
       </w:r>
       <w:r>
@@ -54,10 +90,48 @@
       </w:r>
       <w:r>
         <w:br/>
+      </w:r>
+      <w:r>
+        <w:drawing>
+          <wp:inline distT="0" distB="0" distL="0" distR="0" wp14:anchorId="318BA14D" wp14:editId="16FFD58A">
+            <wp:extent cx="5731510" cy="6311900"/>
+            <wp:effectExtent l="0" t="0" r="2540" b="0"/>
+            <wp:docPr id="415274743" name="Picture 1"/>
+            <wp:cNvGraphicFramePr>
+              <a:graphicFrameLocks xmlns:a="http://schemas.openxmlformats.org/drawingml/2006/main" noChangeAspect="1"/>
+            </wp:cNvGraphicFramePr>
+            <a:graphic xmlns:a="http://schemas.openxmlformats.org/drawingml/2006/main">
+              <a:graphicData uri="http://schemas.openxmlformats.org/drawingml/2006/picture">
+                <pic:pic xmlns:pic="http://schemas.openxmlformats.org/drawingml/2006/picture">
+                  <pic:nvPicPr>
+                    <pic:cNvPr id="415274743" name=""/>
+                    <pic:cNvPicPr/>
+                  </pic:nvPicPr>
+                  <pic:blipFill>
+                    <a:blip r:embed="rId6"/>
+                    <a:stretch>
+                      <a:fillRect/>
+                    </a:stretch>
+                  </pic:blipFill>
+                  <pic:spPr>
+                    <a:xfrm>
+                      <a:off x="0" y="0"/>
+                      <a:ext cx="5731510" cy="6311900"/>
+                    </a:xfrm>
+                    <a:prstGeom prst="rect">
+                      <a:avLst/>
+                    </a:prstGeom>
+                  </pic:spPr>
+                </pic:pic>
+              </a:graphicData>
+            </a:graphic>
+          </wp:inline>
+        </w:drawing>
       </w:r>
     </w:p>
     <w:p>
       <w:r>
+        <w:lastRenderedPageBreak/>
         <w:t>6</w:t>
       </w:r>
       <w:r>
@@ -65,6 +139,46 @@
       </w:r>
       <w:r>
         <w:t>Run Custom Container</w:t>
+      </w:r>
+      <w:r>
+        <w:br/>
+      </w:r>
+      <w:r>
+        <w:drawing>
+          <wp:inline distT="0" distB="0" distL="0" distR="0" wp14:anchorId="07FE0F30" wp14:editId="14B9CC99">
+            <wp:extent cx="5731510" cy="2771140"/>
+            <wp:effectExtent l="0" t="0" r="2540" b="0"/>
+            <wp:docPr id="1466914260" name="Picture 1"/>
+            <wp:cNvGraphicFramePr>
+              <a:graphicFrameLocks xmlns:a="http://schemas.openxmlformats.org/drawingml/2006/main" noChangeAspect="1"/>
+            </wp:cNvGraphicFramePr>
+            <a:graphic xmlns:a="http://schemas.openxmlformats.org/drawingml/2006/main">
+              <a:graphicData uri="http://schemas.openxmlformats.org/drawingml/2006/picture">
+                <pic:pic xmlns:pic="http://schemas.openxmlformats.org/drawingml/2006/picture">
+                  <pic:nvPicPr>
+                    <pic:cNvPr id="1466914260" name=""/>
+                    <pic:cNvPicPr/>
+                  </pic:nvPicPr>
+                  <pic:blipFill>
+                    <a:blip r:embed="rId5"/>
+                    <a:stretch>
+                      <a:fillRect/>
+                    </a:stretch>
+                  </pic:blipFill>
+                  <pic:spPr>
+                    <a:xfrm>
+                      <a:off x="0" y="0"/>
+                      <a:ext cx="5731510" cy="2771140"/>
+                    </a:xfrm>
+                    <a:prstGeom prst="rect">
+                      <a:avLst/>
+                    </a:prstGeom>
+                  </pic:spPr>
+                </pic:pic>
+              </a:graphicData>
+            </a:graphic>
+          </wp:inline>
+        </w:drawing>
       </w:r>
       <w:r>
         <w:br/>

</xml_diff>